<commit_message>
Draw right-to-left metafiles, masked and slanted bitmaps, and PolyTextOut
EMF and WMF SetLayout right to left now mirrors the drawing across the
picture's frame. Text ends at its mirrored place with its letters the right
way round, and bitmaps are mirrored unless the layout keeps their
orientation. Text marked for right-to-left reading (ETO_RTLREADING or
TA_RTLREADING) is written with direction="rtl", so the reader lays out
Hebrew and Arabic in reading order, fitted to its advances.

MaskBlt draws its source through the mask by both raster operations,
worked out on a black page and a white one, so the page shows through
where it is left alone. PlgBlt draws its bitmap onto its parallelogram,
through its mask when it has one. PolyTextOutA/W draws each string as
ExtTextOut does. Masks that claim too much are not decoded, and
PolyTextOut reads only the strings its record holds.

Two new corpus drawings (rtl, masks) in reading-room-metafiles.docx.
</commit_message>
<xml_diff>
--- a/tests/corpus/reading-room-metafiles.docx
+++ b/tests/corpus/reading-room-metafiles.docx
@@ -402,6 +402,76 @@
     </w:p>
     <w:p>
       <w:r>
+        <w:drawing>
+          <wp:inline distT="0" distB="0" distL="0" distR="0">
+            <wp:extent cx="2286000" cy="1524000"/>
+            <wp:docPr id="111" name="Picture 111" descr="The entrance sign as a right-to-left program draws it"/>
+            <a:graphic>
+              <a:graphicData uri="http://schemas.openxmlformats.org/drawingml/2006/picture">
+                <pic:pic>
+                  <pic:nvPicPr>
+                    <pic:cNvPr id="111" name="Picture 111"/>
+                    <pic:cNvPicPr/>
+                  </pic:nvPicPr>
+                  <pic:blipFill>
+                    <a:blip r:embed="rMedia12"/>
+                    <a:stretch>
+                      <a:fillRect/>
+                    </a:stretch>
+                  </pic:blipFill>
+                  <pic:spPr>
+                    <a:xfrm>
+                      <a:off x="0" y="0"/>
+                      <a:ext cx="2286000" cy="1524000"/>
+                    </a:xfrm>
+                    <a:prstGeom prst="rect">
+                      <a:avLst/>
+                    </a:prstGeom>
+                  </pic:spPr>
+                </pic:pic>
+              </a:graphicData>
+            </a:graphic>
+          </wp:inline>
+        </w:drawing>
+      </w:r>
+    </w:p>
+    <w:p>
+      <w:r>
+        <w:drawing>
+          <wp:inline distT="0" distB="0" distL="0" distR="0">
+            <wp:extent cx="2286000" cy="1524000"/>
+            <wp:docPr id="112" name="Picture 112" descr="Shelf markers cut out by masks, a slanted photograph and two labels"/>
+            <a:graphic>
+              <a:graphicData uri="http://schemas.openxmlformats.org/drawingml/2006/picture">
+                <pic:pic>
+                  <pic:nvPicPr>
+                    <pic:cNvPr id="112" name="Picture 112"/>
+                    <pic:cNvPicPr/>
+                  </pic:nvPicPr>
+                  <pic:blipFill>
+                    <a:blip r:embed="rMedia13"/>
+                    <a:stretch>
+                      <a:fillRect/>
+                    </a:stretch>
+                  </pic:blipFill>
+                  <pic:spPr>
+                    <a:xfrm>
+                      <a:off x="0" y="0"/>
+                      <a:ext cx="2286000" cy="1524000"/>
+                    </a:xfrm>
+                    <a:prstGeom prst="rect">
+                      <a:avLst/>
+                    </a:prstGeom>
+                  </pic:spPr>
+                </pic:pic>
+              </a:graphicData>
+            </a:graphic>
+          </wp:inline>
+        </w:drawing>
+      </w:r>
+    </w:p>
+    <w:p>
+      <w:r>
         <w:t xml:space="preserve">Volunteers can print every drawing from any of these formats.</w:t>
       </w:r>
     </w:p>

</xml_diff>